<commit_message>
Fix all tindak lanjut
</commit_message>
<xml_diff>
--- a/storage/app/public/template/template_form6.docx
+++ b/storage/app/public/template/template_form6.docx
@@ -1918,8 +1918,21 @@
             <w:vAlign w:val="center"/>
           </w:tcPr>
           <w:p>
-            <w:r>
-              <w:t>Ir. Juni Sumarmono, M.Sc.,Ph.D. IPU., ASEAN, ENG</w:t>
+            <w:pPr>
+              <w:jc w:val="center"/>
+              <w:rPr>
+                <w:rFonts w:ascii="Arial" w:hAnsi="Arial" w:cs="Arial"/>
+                <w:sz w:val="20"/>
+                <w:szCs w:val="20"/>
+              </w:rPr>
+            </w:pPr>
+            <w:r>
+              <w:rPr>
+                <w:rFonts w:ascii="Arial" w:hAnsi="Arial" w:cs="Arial"/>
+                <w:sz w:val="20"/>
+                <w:szCs w:val="20"/>
+              </w:rPr>
+              <w:t>${user}</w:t>
             </w:r>
           </w:p>
         </w:tc>
@@ -1930,9 +1943,86 @@
           <w:p>
             <w:pPr>
               <w:jc w:val="center"/>
-            </w:pPr>
-            <w:r>
+              <w:rPr>
+                <w:rFonts w:ascii="Arial" w:hAnsi="Arial" w:cs="Arial"/>
+                <w:sz w:val="20"/>
+                <w:szCs w:val="20"/>
+              </w:rPr>
+            </w:pPr>
+            <w:r>
+              <w:rPr>
+                <w:rFonts w:ascii="Arial" w:hAnsi="Arial" w:cs="Arial"/>
+                <w:sz w:val="20"/>
+                <w:szCs w:val="20"/>
+              </w:rPr>
               <w:t>Tanda Tangan</w:t>
+            </w:r>
+          </w:p>
+          <w:p>
+            <w:pPr>
+              <w:jc w:val="center"/>
+              <w:rPr>
+                <w:rFonts w:ascii="Arial" w:hAnsi="Arial" w:cs="Arial"/>
+                <w:sz w:val="20"/>
+                <w:szCs w:val="20"/>
+              </w:rPr>
+            </w:pPr>
+          </w:p>
+          <w:p>
+            <w:pPr>
+              <w:jc w:val="center"/>
+              <w:rPr>
+                <w:rFonts w:ascii="Arial" w:hAnsi="Arial" w:cs="Arial"/>
+                <w:sz w:val="20"/>
+                <w:szCs w:val="20"/>
+              </w:rPr>
+            </w:pPr>
+          </w:p>
+          <w:p>
+            <w:pPr>
+              <w:jc w:val="center"/>
+              <w:rPr>
+                <w:rFonts w:ascii="Arial" w:hAnsi="Arial" w:cs="Arial"/>
+                <w:sz w:val="20"/>
+                <w:szCs w:val="20"/>
+              </w:rPr>
+            </w:pPr>
+          </w:p>
+          <w:p>
+            <w:pPr>
+              <w:rPr>
+                <w:rFonts w:ascii="Arial" w:hAnsi="Arial" w:cs="Arial"/>
+                <w:sz w:val="20"/>
+                <w:szCs w:val="20"/>
+              </w:rPr>
+            </w:pPr>
+          </w:p>
+          <w:p>
+            <w:pPr>
+              <w:jc w:val="center"/>
+              <w:rPr>
+                <w:rFonts w:ascii="Arial" w:hAnsi="Arial" w:cs="Arial"/>
+                <w:sz w:val="20"/>
+                <w:szCs w:val="20"/>
+              </w:rPr>
+            </w:pPr>
+          </w:p>
+          <w:p>
+            <w:pPr>
+              <w:jc w:val="center"/>
+              <w:rPr>
+                <w:rFonts w:ascii="Arial" w:hAnsi="Arial" w:cs="Arial"/>
+                <w:sz w:val="20"/>
+                <w:szCs w:val="20"/>
+              </w:rPr>
+            </w:pPr>
+            <w:r>
+              <w:rPr>
+                <w:rFonts w:ascii="Arial" w:hAnsi="Arial" w:cs="Arial"/>
+                <w:sz w:val="20"/>
+                <w:szCs w:val="20"/>
+              </w:rPr>
+              <w:t>${image_user}</w:t>
             </w:r>
           </w:p>
         </w:tc>

</xml_diff>